<commit_message>
Add final documentation, screenshots and meeting minutes
</commit_message>
<xml_diff>
--- a/Docs/Malia/Malia_R6_R7_Test_Record.docx.docx
+++ b/Docs/Malia/Malia_R6_R7_Test_Record.docx.docx
@@ -122,21 +122,7 @@
         <w:rPr>
           <w:rFonts w:ascii="Times New Roman" w:hAnsi="Times New Roman" w:cs="Times New Roman"/>
         </w:rPr>
-        <w:t xml:space="preserve"> feature/</w:t>
-      </w:r>
-      <w:proofErr w:type="spellStart"/>
-      <w:r>
-        <w:rPr>
-          <w:rFonts w:ascii="Times New Roman" w:hAnsi="Times New Roman" w:cs="Times New Roman"/>
-        </w:rPr>
-        <w:t>malia</w:t>
-      </w:r>
-      <w:proofErr w:type="spellEnd"/>
-      <w:r>
-        <w:rPr>
-          <w:rFonts w:ascii="Times New Roman" w:hAnsi="Times New Roman" w:cs="Times New Roman"/>
-        </w:rPr>
-        <w:t>-import-reports</w:t>
+        <w:t xml:space="preserve"> feature/malia-import-reports</w:t>
       </w:r>
       <w:r>
         <w:rPr>
@@ -3323,7 +3309,6 @@
         </w:rPr>
         <w:t xml:space="preserve">Test inputs and exported reports are stored in </w:t>
       </w:r>
-      <w:proofErr w:type="spellStart"/>
       <w:r>
         <w:rPr>
           <w:rFonts w:ascii="Times New Roman" w:hAnsi="Times New Roman" w:cs="Times New Roman"/>
@@ -3332,7 +3317,6 @@
         </w:rPr>
         <w:t>TestFiles</w:t>
       </w:r>
-      <w:proofErr w:type="spellEnd"/>
       <w:r>
         <w:rPr>
           <w:rFonts w:ascii="Times New Roman" w:hAnsi="Times New Roman" w:cs="Times New Roman"/>
@@ -3650,6 +3634,154 @@
         </w:rPr>
         <w:t>Accessibility extras require separate implementation and testing.</w:t>
       </w:r>
+    </w:p>
+    <w:p>
+      <w:pPr>
+        <w:spacing w:line="240" w:lineRule="auto"/>
+        <w:rPr>
+          <w:rFonts w:ascii="Times New Roman" w:hAnsi="Times New Roman" w:cs="Times New Roman"/>
+          <w:sz w:val="22"/>
+          <w:szCs w:val="22"/>
+        </w:rPr>
+      </w:pPr>
+    </w:p>
+    <w:p>
+      <w:pPr>
+        <w:spacing w:line="240" w:lineRule="auto"/>
+        <w:rPr>
+          <w:rFonts w:ascii="Times New Roman" w:hAnsi="Times New Roman" w:cs="Times New Roman"/>
+          <w:b/>
+          <w:bCs/>
+          <w:sz w:val="22"/>
+          <w:szCs w:val="22"/>
+        </w:rPr>
+      </w:pPr>
+      <w:r>
+        <w:rPr>
+          <w:rFonts w:ascii="Times New Roman" w:hAnsi="Times New Roman" w:cs="Times New Roman"/>
+          <w:b/>
+          <w:bCs/>
+          <w:sz w:val="22"/>
+          <w:szCs w:val="22"/>
+        </w:rPr>
+        <w:t xml:space="preserve">9. CDU virtual machine testing </w:t>
+      </w:r>
+    </w:p>
+    <w:p>
+      <w:pPr>
+        <w:spacing w:line="240" w:lineRule="auto"/>
+        <w:rPr>
+          <w:rFonts w:ascii="Times New Roman" w:hAnsi="Times New Roman" w:cs="Times New Roman"/>
+          <w:sz w:val="22"/>
+          <w:szCs w:val="22"/>
+        </w:rPr>
+      </w:pPr>
+      <w:r>
+        <w:rPr>
+          <w:rFonts w:ascii="Times New Roman" w:hAnsi="Times New Roman" w:cs="Times New Roman"/>
+          <w:sz w:val="22"/>
+          <w:szCs w:val="22"/>
+        </w:rPr>
+        <w:drawing>
+          <wp:inline distT="0" distB="0" distL="0" distR="0" wp14:anchorId="586A4FB1" wp14:editId="3563C8E1">
+            <wp:extent cx="5731510" cy="3220720"/>
+            <wp:effectExtent l="0" t="0" r="2540" b="0"/>
+            <wp:docPr id="444491682" name="Picture 1"/>
+            <wp:cNvGraphicFramePr>
+              <a:graphicFrameLocks xmlns:a="http://schemas.openxmlformats.org/drawingml/2006/main" noChangeAspect="1"/>
+            </wp:cNvGraphicFramePr>
+            <a:graphic xmlns:a="http://schemas.openxmlformats.org/drawingml/2006/main">
+              <a:graphicData uri="http://schemas.openxmlformats.org/drawingml/2006/picture">
+                <pic:pic xmlns:pic="http://schemas.openxmlformats.org/drawingml/2006/picture">
+                  <pic:nvPicPr>
+                    <pic:cNvPr id="444491682" name=""/>
+                    <pic:cNvPicPr/>
+                  </pic:nvPicPr>
+                  <pic:blipFill>
+                    <a:blip r:embed="rId6"/>
+                    <a:stretch>
+                      <a:fillRect/>
+                    </a:stretch>
+                  </pic:blipFill>
+                  <pic:spPr>
+                    <a:xfrm>
+                      <a:off x="0" y="0"/>
+                      <a:ext cx="5731510" cy="3220720"/>
+                    </a:xfrm>
+                    <a:prstGeom prst="rect">
+                      <a:avLst/>
+                    </a:prstGeom>
+                  </pic:spPr>
+                </pic:pic>
+              </a:graphicData>
+            </a:graphic>
+          </wp:inline>
+        </w:drawing>
+      </w:r>
+    </w:p>
+    <w:p>
+      <w:pPr>
+        <w:spacing w:line="240" w:lineRule="auto"/>
+        <w:rPr>
+          <w:rFonts w:ascii="Times New Roman" w:hAnsi="Times New Roman" w:cs="Times New Roman"/>
+          <w:sz w:val="22"/>
+          <w:szCs w:val="22"/>
+        </w:rPr>
+      </w:pPr>
+      <w:r>
+        <w:rPr>
+          <w:rFonts w:ascii="Times New Roman" w:hAnsi="Times New Roman" w:cs="Times New Roman"/>
+          <w:sz w:val="22"/>
+          <w:szCs w:val="22"/>
+        </w:rPr>
+        <w:t>“Successfully started the application in the CDU IT Desktop VM and opened the login page.”</w:t>
+      </w:r>
+    </w:p>
+    <w:p>
+      <w:pPr>
+        <w:spacing w:line="240" w:lineRule="auto"/>
+        <w:rPr>
+          <w:rFonts w:ascii="Times New Roman" w:hAnsi="Times New Roman" w:cs="Times New Roman"/>
+          <w:sz w:val="22"/>
+          <w:szCs w:val="22"/>
+        </w:rPr>
+      </w:pPr>
+      <w:r>
+        <w:rPr>
+          <w:rFonts w:ascii="Times New Roman" w:hAnsi="Times New Roman" w:cs="Times New Roman"/>
+          <w:sz w:val="22"/>
+          <w:szCs w:val="22"/>
+        </w:rPr>
+        <w:t xml:space="preserve">Keep report exports and CSV importing marked </w:t>
+      </w:r>
+      <w:r>
+        <w:rPr>
+          <w:rFonts w:ascii="Times New Roman" w:hAnsi="Times New Roman" w:cs="Times New Roman"/>
+          <w:b/>
+          <w:bCs/>
+          <w:sz w:val="22"/>
+          <w:szCs w:val="22"/>
+        </w:rPr>
+        <w:t>not yet verified on the VM</w:t>
+      </w:r>
+      <w:r>
+        <w:rPr>
+          <w:rFonts w:ascii="Times New Roman" w:hAnsi="Times New Roman" w:cs="Times New Roman"/>
+          <w:sz w:val="22"/>
+          <w:szCs w:val="22"/>
+        </w:rPr>
+        <w:t xml:space="preserve"> unless you tested them. Your earlier PC test results remain valid.</w:t>
+      </w:r>
+    </w:p>
+    <w:p>
+      <w:pPr>
+        <w:spacing w:line="240" w:lineRule="auto"/>
+        <w:rPr>
+          <w:rFonts w:ascii="Times New Roman" w:hAnsi="Times New Roman" w:cs="Times New Roman"/>
+          <w:sz w:val="22"/>
+          <w:szCs w:val="22"/>
+        </w:rPr>
+      </w:pPr>
     </w:p>
     <w:p>
       <w:pPr>

</xml_diff>